<commit_message>
docs: renumber the request sections sequentially
Las secciones de especificacion de campos y de variables adicionales se habian
insertado como 3.bis y 3.ter para no correr la numeracion existente. Esa
convencion tiene sentido en un texto ya promulgado, no en un documento que nadie
ha leido todavia, y para el especialista que lo abre por primera vez es una
rareza que distrae.

Pasan a 4 y 5, y el resto corre hasta 8. Se actualizan las referencias cruzadas
internas y los subapartados 6.1 y 6.2.

Co-Authored-By: Claude Opus 5 <noreply@anthropic.com>
</commit_message>
<xml_diff>
--- a/docs/docs/solicitud_validacion_expertos.docx
+++ b/docs/docs/solicitud_validacion_expertos.docx
@@ -2341,13 +2341,13 @@
     </w:p>
     <w:bookmarkEnd w:id="15"/>
     <w:bookmarkEnd w:id="16"/>
-    <w:bookmarkStart w:id="22" w:name="bis.-especificación-de-campos"/>
+    <w:bookmarkStart w:id="22" w:name="especificación-de-campos"/>
     <w:p>
       <w:pPr>
         <w:pStyle w:val="Heading2"/>
       </w:pPr>
       <w:r>
-        <w:t xml:space="preserve">3.bis. Especificación de campos</w:t>
+        <w:t xml:space="preserve">4. Especificación de campos</w:t>
       </w:r>
     </w:p>
     <w:p>
@@ -6912,13 +6912,13 @@
     </w:p>
     <w:bookmarkEnd w:id="21"/>
     <w:bookmarkEnd w:id="22"/>
-    <w:bookmarkStart w:id="26" w:name="ter.-variables-adicionales-deseables"/>
+    <w:bookmarkStart w:id="26" w:name="variables-adicionales-deseables"/>
     <w:p>
       <w:pPr>
         <w:pStyle w:val="Heading2"/>
       </w:pPr>
       <w:r>
-        <w:t xml:space="preserve">3.ter. Variables adicionales deseables</w:t>
+        <w:t xml:space="preserve">5. Variables adicionales deseables</w:t>
       </w:r>
     </w:p>
     <w:p>
@@ -7729,7 +7729,7 @@
         <w:t xml:space="preserve"> </w:t>
       </w:r>
       <w:r>
-        <w:t xml:space="preserve">Estas variables no requieren la codificación estricta de la sección 3.bis, ya</w:t>
+        <w:t xml:space="preserve">Estas variables no requieren la codificación estricta de la sección 4, ya</w:t>
       </w:r>
       <w:r>
         <w:t xml:space="preserve"> </w:t>
@@ -7827,7 +7827,7 @@
         <w:pStyle w:val="Heading2"/>
       </w:pPr>
       <w:r>
-        <w:t xml:space="preserve">4. Qué esperamos de esta validación</w:t>
+        <w:t xml:space="preserve">6. Qué esperamos de esta validación</w:t>
       </w:r>
     </w:p>
     <w:p>
@@ -7882,7 +7882,7 @@
         <w:pStyle w:val="Heading3"/>
       </w:pPr>
       <w:r>
-        <w:t xml:space="preserve">4.1 Pertinencia</w:t>
+        <w:t xml:space="preserve">6.1 Pertinencia</w:t>
       </w:r>
     </w:p>
     <w:p>
@@ -7958,7 +7958,7 @@
         <w:pStyle w:val="Heading3"/>
       </w:pPr>
       <w:r>
-        <w:t xml:space="preserve">4.2 Replicabilidad</w:t>
+        <w:t xml:space="preserve">6.2 Replicabilidad</w:t>
       </w:r>
     </w:p>
     <w:p>
@@ -8048,7 +8048,7 @@
         <w:pStyle w:val="Heading2"/>
       </w:pPr>
       <w:r>
-        <w:t xml:space="preserve">5. Consideraciones éticas</w:t>
+        <w:t xml:space="preserve">7. Consideraciones éticas</w:t>
       </w:r>
     </w:p>
     <w:p>
@@ -8121,7 +8121,7 @@
         <w:pStyle w:val="Heading2"/>
       </w:pPr>
       <w:r>
-        <w:t xml:space="preserve">6. Contribución esperada para los participantes</w:t>
+        <w:t xml:space="preserve">8. Contribución esperada para los participantes</w:t>
       </w:r>
     </w:p>
     <w:p>

</xml_diff>

<commit_message>
docs: add team emails and script the PDF build
Los tres correos institucionales pasan a una tabla en la cabecera y el cierre
nombra un contacto concreto en lugar de "equipo de investigacion": quien reciba
la solicitud necesita saber a quien responder.

Se agrega docs/assets/build-pdf.sh, que encadena pandoc, el arreglo del bloque
mermaid y la impresion con Chrome. Pandoc escapa las entidades HTML dentro de
esos bloques y la libreria falla con "Syntax error in text" si se le pasan asi;
el paso de desescapado estaba resuelto a mano y se perdia entre regeneraciones.

Co-Authored-By: Claude Opus 5 <noreply@anthropic.com>
</commit_message>
<xml_diff>
--- a/docs/docs/solicitud_validacion_expertos.docx
+++ b/docs/docs/solicitud_validacion_expertos.docx
@@ -90,15 +90,119 @@
           <w:b/>
           <w:bCs/>
         </w:rPr>
-        <w:t xml:space="preserve">Equipo:</w:t>
-      </w:r>
-      <w:r>
-        <w:t xml:space="preserve"> </w:t>
-      </w:r>
-      <w:r>
-        <w:t xml:space="preserve">Abel Guevara Huasco · Verónica Vergara Rojas · Pamela Vallejos Cotrina</w:t>
+        <w:t xml:space="preserve">Equipo de investigación:</w:t>
       </w:r>
     </w:p>
+    <w:tbl>
+      <w:tblPr>
+        <w:tblStyle w:val="Table"/>
+        <w:tblW w:type="auto" w:w="0"/>
+        <w:tblLook w:firstRow="1" w:lastRow="0" w:firstColumn="0" w:lastColumn="0" w:noHBand="0" w:noVBand="0" w:val="0020"/>
+      </w:tblPr>
+      <w:tblGrid>
+        <w:gridCol w:w="3960"/>
+        <w:gridCol w:w="3960"/>
+      </w:tblGrid>
+      <w:tr>
+        <w:trPr>
+          <w:tblHeader w:val="on"/>
+        </w:trPr>
+        <w:tc>
+          <w:tcPr/>
+          <w:p>
+            <w:pPr>
+              <w:pStyle w:val="Compact"/>
+            </w:pPr>
+            <w:r>
+              <w:t xml:space="preserve">Integrante</w:t>
+            </w:r>
+          </w:p>
+        </w:tc>
+        <w:tc>
+          <w:tcPr/>
+          <w:p>
+            <w:pPr>
+              <w:pStyle w:val="Compact"/>
+            </w:pPr>
+            <w:r>
+              <w:t xml:space="preserve">Correo institucional</w:t>
+            </w:r>
+          </w:p>
+        </w:tc>
+      </w:tr>
+      <w:tr>
+        <w:tc>
+          <w:tcPr/>
+          <w:p>
+            <w:pPr>
+              <w:pStyle w:val="Compact"/>
+            </w:pPr>
+            <w:r>
+              <w:t xml:space="preserve">Abel Guevara Huasco</w:t>
+            </w:r>
+          </w:p>
+        </w:tc>
+        <w:tc>
+          <w:tcPr/>
+          <w:p>
+            <w:pPr>
+              <w:pStyle w:val="Compact"/>
+            </w:pPr>
+            <w:r>
+              <w:t xml:space="preserve">abelguevara@upeu.edu.pe</w:t>
+            </w:r>
+          </w:p>
+        </w:tc>
+      </w:tr>
+      <w:tr>
+        <w:tc>
+          <w:tcPr/>
+          <w:p>
+            <w:pPr>
+              <w:pStyle w:val="Compact"/>
+            </w:pPr>
+            <w:r>
+              <w:t xml:space="preserve">Verónica Vergara Rojas</w:t>
+            </w:r>
+          </w:p>
+        </w:tc>
+        <w:tc>
+          <w:tcPr/>
+          <w:p>
+            <w:pPr>
+              <w:pStyle w:val="Compact"/>
+            </w:pPr>
+            <w:r>
+              <w:t xml:space="preserve">veronica.vergara@upeu.edu.pe</w:t>
+            </w:r>
+          </w:p>
+        </w:tc>
+      </w:tr>
+      <w:tr>
+        <w:tc>
+          <w:tcPr/>
+          <w:p>
+            <w:pPr>
+              <w:pStyle w:val="Compact"/>
+            </w:pPr>
+            <w:r>
+              <w:t xml:space="preserve">Pamela Vallejos Cotrina</w:t>
+            </w:r>
+          </w:p>
+        </w:tc>
+        <w:tc>
+          <w:tcPr/>
+          <w:p>
+            <w:pPr>
+              <w:pStyle w:val="Compact"/>
+            </w:pPr>
+            <w:r>
+              <w:t xml:space="preserve">zulin.vallejos@upeu.edu.pe</w:t>
+            </w:r>
+          </w:p>
+        </w:tc>
+      </w:tr>
+    </w:tbl>
     <w:p>
       <w:r>
         <w:pict>
@@ -6708,7 +6812,17 @@
           <w:i/>
           <w:iCs/>
         </w:rPr>
-        <w:t xml:space="preserve">Contacto: equipo de investigación — EP Ingeniería de Sistemas, Universidad Peruana Unión.</w:t>
+        <w:t xml:space="preserve">Contacto: Abel Guevara Huasco — abelguevara@upeu.edu.pe</w:t>
+      </w:r>
+      <w:r>
+        <w:t xml:space="preserve"> </w:t>
+      </w:r>
+      <w:r>
+        <w:rPr>
+          <w:i/>
+          <w:iCs/>
+        </w:rPr>
+        <w:t xml:space="preserve">EP Ingeniería de Sistemas, Universidad Peruana Unión.</w:t>
       </w:r>
     </w:p>
     <w:p>

</xml_diff>

<commit_message>
docs: inline the team emails and fit the method diagram
Los correos vuelven a la linea del equipo: una tabla de tres filas para tres
direcciones gastaba media cabecera sin ganar legibilidad.

El diagrama CRISP-DM se compacta. Las etiquetas de los nodos pasan de tres
lineas a una y las de los retornos se acortan, de modo que el grafico ocupa
menos de un tercio de pagina en lugar de media. Se limita la altura del SVG a
88 mm y se sube el tipo a 15 px para que el texto siga siendo legible al
reducirse.

Se probo una version en dos filas con subgraphs, pero mermaid reordenaba las
fases y el flujo dejaba de leerse en secuencia; se descarta.

Co-Authored-By: Claude Opus 5 <noreply@anthropic.com>
</commit_message>
<xml_diff>
--- a/docs/docs/solicitud_validacion_expertos.docx
+++ b/docs/docs/solicitud_validacion_expertos.docx
@@ -90,119 +90,21 @@
           <w:b/>
           <w:bCs/>
         </w:rPr>
-        <w:t xml:space="preserve">Equipo de investigación:</w:t>
+        <w:t xml:space="preserve">Equipo:</w:t>
+      </w:r>
+      <w:r>
+        <w:t xml:space="preserve"> </w:t>
+      </w:r>
+      <w:r>
+        <w:t xml:space="preserve">Abel Guevara Huasco (abelguevara@upeu.edu.pe) · Verónica Vergara Rojas</w:t>
+      </w:r>
+      <w:r>
+        <w:t xml:space="preserve"> </w:t>
+      </w:r>
+      <w:r>
+        <w:t xml:space="preserve">(veronica.vergara@upeu.edu.pe) · Pamela Vallejos Cotrina (zulin.vallejos@upeu.edu.pe)</w:t>
       </w:r>
     </w:p>
-    <w:tbl>
-      <w:tblPr>
-        <w:tblStyle w:val="Table"/>
-        <w:tblW w:type="auto" w:w="0"/>
-        <w:tblLook w:firstRow="1" w:lastRow="0" w:firstColumn="0" w:lastColumn="0" w:noHBand="0" w:noVBand="0" w:val="0020"/>
-      </w:tblPr>
-      <w:tblGrid>
-        <w:gridCol w:w="3960"/>
-        <w:gridCol w:w="3960"/>
-      </w:tblGrid>
-      <w:tr>
-        <w:trPr>
-          <w:tblHeader w:val="on"/>
-        </w:trPr>
-        <w:tc>
-          <w:tcPr/>
-          <w:p>
-            <w:pPr>
-              <w:pStyle w:val="Compact"/>
-            </w:pPr>
-            <w:r>
-              <w:t xml:space="preserve">Integrante</w:t>
-            </w:r>
-          </w:p>
-        </w:tc>
-        <w:tc>
-          <w:tcPr/>
-          <w:p>
-            <w:pPr>
-              <w:pStyle w:val="Compact"/>
-            </w:pPr>
-            <w:r>
-              <w:t xml:space="preserve">Correo institucional</w:t>
-            </w:r>
-          </w:p>
-        </w:tc>
-      </w:tr>
-      <w:tr>
-        <w:tc>
-          <w:tcPr/>
-          <w:p>
-            <w:pPr>
-              <w:pStyle w:val="Compact"/>
-            </w:pPr>
-            <w:r>
-              <w:t xml:space="preserve">Abel Guevara Huasco</w:t>
-            </w:r>
-          </w:p>
-        </w:tc>
-        <w:tc>
-          <w:tcPr/>
-          <w:p>
-            <w:pPr>
-              <w:pStyle w:val="Compact"/>
-            </w:pPr>
-            <w:r>
-              <w:t xml:space="preserve">abelguevara@upeu.edu.pe</w:t>
-            </w:r>
-          </w:p>
-        </w:tc>
-      </w:tr>
-      <w:tr>
-        <w:tc>
-          <w:tcPr/>
-          <w:p>
-            <w:pPr>
-              <w:pStyle w:val="Compact"/>
-            </w:pPr>
-            <w:r>
-              <w:t xml:space="preserve">Verónica Vergara Rojas</w:t>
-            </w:r>
-          </w:p>
-        </w:tc>
-        <w:tc>
-          <w:tcPr/>
-          <w:p>
-            <w:pPr>
-              <w:pStyle w:val="Compact"/>
-            </w:pPr>
-            <w:r>
-              <w:t xml:space="preserve">veronica.vergara@upeu.edu.pe</w:t>
-            </w:r>
-          </w:p>
-        </w:tc>
-      </w:tr>
-      <w:tr>
-        <w:tc>
-          <w:tcPr/>
-          <w:p>
-            <w:pPr>
-              <w:pStyle w:val="Compact"/>
-            </w:pPr>
-            <w:r>
-              <w:t xml:space="preserve">Pamela Vallejos Cotrina</w:t>
-            </w:r>
-          </w:p>
-        </w:tc>
-        <w:tc>
-          <w:tcPr/>
-          <w:p>
-            <w:pPr>
-              <w:pStyle w:val="Compact"/>
-            </w:pPr>
-            <w:r>
-              <w:t xml:space="preserve">zulin.vallejos@upeu.edu.pe</w:t>
-            </w:r>
-          </w:p>
-        </w:tc>
-      </w:tr>
-    </w:tbl>
     <w:p>
       <w:r>
         <w:pict>
@@ -544,7 +446,7 @@
         <w:rPr>
           <w:rStyle w:val="VerbatimChar"/>
         </w:rPr>
-        <w:t xml:space="preserve">  F1["&lt;b&gt;1. Comprensión del negocio&lt;/b&gt;&lt;br/&gt;Focalización de recursos&lt;br/&gt;en salud pública"]</w:t>
+        <w:t xml:space="preserve">  F1["&lt;b&gt;1.&lt;/b&gt; Comprensión del negocio"]</w:t>
       </w:r>
       <w:r>
         <w:br/>
@@ -553,7 +455,7 @@
         <w:rPr>
           <w:rStyle w:val="VerbatimChar"/>
         </w:rPr>
-        <w:t xml:space="preserve">  F2["&lt;b&gt;2. Comprensión de los datos&lt;/b&gt;&lt;br/&gt;Auditoría de 19 años&lt;br/&gt;de ENDES"]</w:t>
+        <w:t xml:space="preserve">  F2["&lt;b&gt;2.&lt;/b&gt; Comprensión de los datos"]</w:t>
       </w:r>
       <w:r>
         <w:br/>
@@ -562,7 +464,7 @@
         <w:rPr>
           <w:rStyle w:val="VerbatimChar"/>
         </w:rPr>
-        <w:t xml:space="preserve">  F3["&lt;b&gt;3. Preparación de los datos&lt;/b&gt;&lt;br/&gt;Integración, limpieza y&lt;br/&gt;selección de variables"]</w:t>
+        <w:t xml:space="preserve">  F3["&lt;b&gt;3.&lt;/b&gt; Preparación de los datos"]</w:t>
       </w:r>
       <w:r>
         <w:br/>
@@ -571,7 +473,7 @@
         <w:rPr>
           <w:rStyle w:val="VerbatimChar"/>
         </w:rPr>
-        <w:t xml:space="preserve">  F4["&lt;b&gt;4. Modelado&lt;/b&gt;&lt;br/&gt;Seis algoritmos&lt;br/&gt;comparados"]</w:t>
+        <w:t xml:space="preserve">  F4["&lt;b&gt;4.&lt;/b&gt; Modelado"]</w:t>
       </w:r>
       <w:r>
         <w:br/>
@@ -580,7 +482,7 @@
         <w:rPr>
           <w:rStyle w:val="VerbatimChar"/>
         </w:rPr>
-        <w:t xml:space="preserve">  F5["&lt;b&gt;5. Evaluación&lt;/b&gt;&lt;br/&gt;Desempeño y&lt;br/&gt;explicabilidad"]</w:t>
+        <w:t xml:space="preserve">  F5["&lt;b&gt;5.&lt;/b&gt; Evaluación"]</w:t>
       </w:r>
       <w:r>
         <w:br/>
@@ -589,7 +491,7 @@
         <w:rPr>
           <w:rStyle w:val="VerbatimChar"/>
         </w:rPr>
-        <w:t xml:space="preserve">  F6["&lt;b&gt;6. Despliegue&lt;/b&gt;&lt;br/&gt;Aplicativo web&lt;br/&gt;de consulta"]</w:t>
+        <w:t xml:space="preserve">  F6["&lt;b&gt;6.&lt;/b&gt; Despliegue"]</w:t>
       </w:r>
       <w:r>
         <w:br/>
@@ -613,7 +515,7 @@
         <w:rPr>
           <w:rStyle w:val="VerbatimChar"/>
         </w:rPr>
-        <w:t xml:space="preserve">  F2 -. "los datos obligan a replantear el objetivo" .-&gt; F1</w:t>
+        <w:t xml:space="preserve">  F2 -. "replantear el objetivo" .-&gt; F1</w:t>
       </w:r>
       <w:r>
         <w:br/>
@@ -622,7 +524,7 @@
         <w:rPr>
           <w:rStyle w:val="VerbatimChar"/>
         </w:rPr>
-        <w:t xml:space="preserve">  F4 -. "faltan variables o requieren otro formato" .-&gt; F3</w:t>
+        <w:t xml:space="preserve">  F4 -. "faltan variables" .-&gt; F3</w:t>
       </w:r>
       <w:r>
         <w:br/>
@@ -631,7 +533,7 @@
         <w:rPr>
           <w:rStyle w:val="VerbatimChar"/>
         </w:rPr>
-        <w:t xml:space="preserve">  F5 -. "el desempeño no alcanza la meta" .-&gt; F4</w:t>
+        <w:t xml:space="preserve">  F5 -. "no alcanza la meta" .-&gt; F4</w:t>
       </w:r>
       <w:r>
         <w:br/>
@@ -640,28 +542,19 @@
         <w:rPr>
           <w:rStyle w:val="VerbatimChar"/>
         </w:rPr>
-        <w:t xml:space="preserve">  F5 -. "no responde a la necesidad" .-&gt; F1</w:t>
+        <w:t xml:space="preserve">  F6 -. "nuevas necesidades" .-&gt; F1</w:t>
       </w:r>
       <w:r>
         <w:br/>
       </w:r>
       <w:r>
+        <w:br/>
+      </w:r>
+      <w:r>
         <w:rPr>
           <w:rStyle w:val="VerbatimChar"/>
         </w:rPr>
-        <w:t xml:space="preserve">  F6 -. "el uso real revela nuevas necesidades" .-&gt; F1</w:t>
-      </w:r>
-      <w:r>
-        <w:br/>
-      </w:r>
-      <w:r>
-        <w:br/>
-      </w:r>
-      <w:r>
-        <w:rPr>
-          <w:rStyle w:val="VerbatimChar"/>
-        </w:rPr>
-        <w:t xml:space="preserve">  classDef fase fill:#eef3f9,stroke:#003366,stroke-width:1.5px,color:#1a2530</w:t>
+        <w:t xml:space="preserve">  classDef fase fill:#eef3f9,stroke:#003366,stroke-width:1.4px,color:#1a2530</w:t>
       </w:r>
       <w:r>
         <w:br/>

</xml_diff>